<commit_message>
docs: update Parts I-VI to current repo state and add figures
</commit_message>
<xml_diff>
--- a/Docs/Thermo-Tactics_Parts3-6_Data_Integration_Repository_Plan.docx
+++ b/Docs/Thermo-Tactics_Parts3-6_Data_Integration_Repository_Plan.docx
@@ -1784,7 +1784,24 @@
           <w:sz w:val="20"/>
           <w:szCs w:val="20"/>
         </w:rPr>
-        <w:t xml:space="preserve">Record 2 ended at 1.60 °C, above the 1.5 °C line: two undefended lanes were hit in the same enemy phase (+0.10 °C each), and the loss check runs after the whole phase. This is expected behaviour.</w:t>
+        <w:t xml:space="preserve">These records were saved before the product was renamed, so they are in the old </w:t>
+      </w:r>
+      <w:r>
+        <w:rPr>
+          <w:rFonts w:ascii="Consolas" w:cs="Consolas" w:eastAsia="Consolas" w:hAnsi="Consolas"/>
+          <w:color w:val="0D47A1"/>
+          <w:sz w:val="19"/>
+          <w:szCs w:val="19"/>
+        </w:rPr>
+        <w:t xml:space="preserve">TESTING CAPSTONE</w:t>
+      </w:r>
+      <w:r>
+        <w:rPr>
+          <w:rFonts w:ascii="Arial" w:cs="Arial" w:eastAsia="Arial" w:hAnsi="Arial"/>
+          <w:sz w:val="20"/>
+          <w:szCs w:val="20"/>
+        </w:rPr>
+        <w:t xml:space="preserve"> save folder; the renamed game starts a new, empty database. Record 2 ended at 1.60 °C, above the 1.5 °C line: two undefended lanes were hit in the same enemy phase (+0.10 °C each), and the loss check runs after the whole phase. This is expected behaviour.</w:t>
       </w:r>
     </w:p>
     <w:p>
@@ -16041,7 +16058,7 @@
                 <w:sz w:val="17"/>
                 <w:szCs w:val="17"/>
               </w:rPr>
-              <w:t xml:space="preserve">AppData/LocalLow/DefaultCompany/TESTING CAPSTONE/</w:t>
+              <w:t xml:space="preserve">AppData/LocalLow/DefaultCompany/Thermo-Tactics/</w:t>
             </w:r>
             <w:r>
               <w:rPr>
@@ -16051,7 +16068,7 @@
                 <w:sz w:val="18"/>
                 <w:szCs w:val="18"/>
               </w:rPr>
-              <w:t xml:space="preserve">)</w:t>
+              <w:t xml:space="preserve">, a folder that follows the company and product names)</w:t>
             </w:r>
           </w:p>
         </w:tc>
@@ -20433,7 +20450,7 @@
           <w:sz w:val="20"/>
           <w:szCs w:val="20"/>
         </w:rPr>
-        <w:t xml:space="preserve"> the Unity project is under Git and has been pushed to GitHub. The </w:t>
+        <w:t xml:space="preserve"> the Unity project is under Git and has been pushed to GitHub. At the time of writing, </w:t>
       </w:r>
       <w:r>
         <w:rPr>
@@ -20450,7 +20467,7 @@
           <w:sz w:val="20"/>
           <w:szCs w:val="20"/>
         </w:rPr>
-        <w:t xml:space="preserve"> branch holds </w:t>
+        <w:t xml:space="preserve"> holds </w:t>
       </w:r>
       <w:r>
         <w:rPr>
@@ -20460,7 +20477,7 @@
           <w:sz w:val="20"/>
           <w:szCs w:val="20"/>
         </w:rPr>
-        <w:t xml:space="preserve">11 commits</w:t>
+        <w:t xml:space="preserve">15 commits</w:t>
       </w:r>
       <w:r>
         <w:rPr>
@@ -20478,7 +20495,7 @@
           <w:sz w:val="20"/>
           <w:szCs w:val="20"/>
         </w:rPr>
-        <w:t xml:space="preserve">929 tracked files</w:t>
+        <w:t xml:space="preserve">926 tracked files</w:t>
       </w:r>
       <w:r>
         <w:rPr>
@@ -20486,7 +20503,24 @@
           <w:sz w:val="20"/>
           <w:szCs w:val="20"/>
         </w:rPr>
-        <w:t xml:space="preserve">. It contains the playable Baguio Level 1 prototype: 22 C# scripts, 10 animated units, 3 waves, the Baguio scene and a SQLite results database. Unity's generated folders are excluded; </w:t>
+        <w:t xml:space="preserve">, and a </w:t>
+      </w:r>
+      <w:r>
+        <w:rPr>
+          <w:rFonts w:ascii="Consolas" w:cs="Consolas" w:eastAsia="Consolas" w:hAnsi="Consolas"/>
+          <w:color w:val="0D47A1"/>
+          <w:sz w:val="19"/>
+          <w:szCs w:val="19"/>
+        </w:rPr>
+        <w:t xml:space="preserve">develop</w:t>
+      </w:r>
+      <w:r>
+        <w:rPr>
+          <w:rFonts w:ascii="Arial" w:cs="Arial" w:eastAsia="Arial" w:hAnsi="Arial"/>
+          <w:sz w:val="20"/>
+          <w:szCs w:val="20"/>
+        </w:rPr>
+        <w:t xml:space="preserve"> branch exists. It contains the playable Baguio Level 1 prototype: 22 C# scripts, 10 animated units, 3 waves, the Baguio scene and a SQLite results database. Unity's generated folders are excluded; </w:t>
       </w:r>
       <w:r>
         <w:rPr>
@@ -21138,7 +21172,27 @@
                 <w:sz w:val="18"/>
                 <w:szCs w:val="18"/>
               </w:rPr>
-              <w:t xml:space="preserve">The local project folder is "TESTING CAPSTONE". The product name in Player Settings is still "TESTING CAPSTONE" and should be renamed "Thermo-Tactics" before the first APK build.</w:t>
+              <w:t xml:space="preserve">Product name (Player Settings): </w:t>
+            </w:r>
+            <w:r>
+              <w:rPr>
+                <w:rFonts w:ascii="Arial" w:cs="Arial" w:eastAsia="Arial" w:hAnsi="Arial"/>
+                <w:b/>
+                <w:bCs/>
+                <w:sz w:val="18"/>
+                <w:szCs w:val="18"/>
+              </w:rPr>
+              <w:t xml:space="preserve">Thermo-Tactics</w:t>
+            </w:r>
+            <w:r>
+              <w:rPr>
+                <w:rFonts w:ascii="Arial" w:cs="Arial" w:eastAsia="Arial" w:hAnsi="Arial"/>
+                <w:b w:val="false"/>
+                <w:bCs w:val="false"/>
+                <w:sz w:val="18"/>
+                <w:szCs w:val="18"/>
+              </w:rPr>
+              <w:t xml:space="preserve">. The local project folder on the developer's PC is still named "TESTING CAPSTONE"; this does not affect the build.</w:t>
             </w:r>
           </w:p>
         </w:tc>
@@ -21368,7 +21422,7 @@
                 <w:sz w:val="18"/>
                 <w:szCs w:val="18"/>
               </w:rPr>
-              <w:t xml:space="preserve">11 commits on </w:t>
+              <w:t xml:space="preserve">15 commits on </w:t>
             </w:r>
             <w:r>
               <w:rPr>
@@ -21455,7 +21509,7 @@
                 <w:sz w:val="18"/>
                 <w:szCs w:val="18"/>
               </w:rPr>
-              <w:t xml:space="preserve"> · 2 README · 3 project settings and packages · 4 gameplay scripts · 5 editor builder · 6 unit sprites and Baguio art · 7 animations · 8 unit, wave and level data · 9 Baguio Level 1 scene · 10 remaining assets and meta files · 11 move the results database to SQLite</w:t>
+              <w:t xml:space="preserve"> · 2 README · 3 project settings and packages · 4 gameplay scripts · 5 editor builder · 6 unit sprites and Baguio art · 7 animations · 8 unit, wave and level data · 9 Baguio Level 1 scene · 10 remaining assets and meta files · 11 move the results database to SQLite · 12 stop tracking Plastic and IDE files · 13 README corrections and team · 14 rename product, Visible Meta Files, build only Baguio_Level1 · 15 add Parts I–VI documentation</w:t>
             </w:r>
           </w:p>
         </w:tc>
@@ -21581,18 +21635,17 @@
                 <w:sz w:val="18"/>
                 <w:szCs w:val="18"/>
               </w:rPr>
-              <w:t xml:space="preserve">Covers the game summary and status; requirements (Unity version, packages); how to clone and open the project; how to play and the rule values; implemented features; the project structure; the SQLite schema and queries; and the version-control status. Corrected on 9 October 2026: target API 23, </w:t>
-            </w:r>
-            <w:r>
-              <w:rPr>
-                <w:rFonts w:ascii="Consolas" w:cs="Consolas" w:eastAsia="Consolas" w:hAnsi="Consolas"/>
-                <w:b w:val="false"/>
-                <w:bCs w:val="false"/>
-                <w:color w:val="0D47A1"/>
-                <w:sz w:val="17"/>
-                <w:szCs w:val="17"/>
-              </w:rPr>
-              <w:t xml:space="preserve">main</w:t>
+              <w:t xml:space="preserve">Covers the game summary and status; requirements (Unity version, packages); how to clone and open the project; how to play and the rule values; implemented features; the project structure; the SQLite schema and queries; and the version-control status. Corrected on 9 October 2026 (target API 23, branches, version-control settings). The team table lists the four members (Edz Steinar Bederico, Jon Francis Gellido, Rodge Emanuel Ramos, Jherwin Reyes). </w:t>
+            </w:r>
+            <w:r>
+              <w:rPr>
+                <w:rFonts w:ascii="Arial" w:cs="Arial" w:eastAsia="Arial" w:hAnsi="Arial"/>
+                <w:b/>
+                <w:bCs/>
+                <w:sz w:val="18"/>
+                <w:szCs w:val="18"/>
+              </w:rPr>
+              <w:t xml:space="preserve">Still to do:</w:t>
             </w:r>
             <w:r>
               <w:rPr>
@@ -21602,27 +21655,7 @@
                 <w:sz w:val="18"/>
                 <w:szCs w:val="18"/>
               </w:rPr>
-              <w:t xml:space="preserve"> as the only current branch, and the Version Control mode still to change. Commit this README change. </w:t>
-            </w:r>
-            <w:r>
-              <w:rPr>
-                <w:rFonts w:ascii="Arial" w:cs="Arial" w:eastAsia="Arial" w:hAnsi="Arial"/>
-                <w:b/>
-                <w:bCs/>
-                <w:sz w:val="18"/>
-                <w:szCs w:val="18"/>
-              </w:rPr>
-              <w:t xml:space="preserve">Still to do:</w:t>
-            </w:r>
-            <w:r>
-              <w:rPr>
-                <w:rFonts w:ascii="Arial" w:cs="Arial" w:eastAsia="Arial" w:hAnsi="Arial"/>
-                <w:b w:val="false"/>
-                <w:bCs w:val="false"/>
-                <w:sz w:val="18"/>
-                <w:szCs w:val="18"/>
-              </w:rPr>
-              <w:t xml:space="preserve"> fill in the team member and role table.</w:t>
+              <w:t xml:space="preserve"> fill in each member's role.</w:t>
             </w:r>
           </w:p>
         </w:tc>
@@ -22122,85 +22155,7 @@
                 <w:sz w:val="18"/>
                 <w:szCs w:val="18"/>
               </w:rPr>
-              <w:t xml:space="preserve">.</w:t>
-            </w:r>
-          </w:p>
-          <w:p>
-            <w:pPr>
-              <w:spacing w:after="20" w:line="240"/>
-            </w:pPr>
-            <w:r>
-              <w:rPr>
-                <w:rFonts w:ascii="Arial" w:cs="Arial" w:eastAsia="Arial" w:hAnsi="Arial"/>
-                <w:b w:val="false"/>
-                <w:bCs w:val="false"/>
-                <w:sz w:val="18"/>
-                <w:szCs w:val="18"/>
-              </w:rPr>
-              <w:t xml:space="preserve">Cleanup needed: </w:t>
-            </w:r>
-            <w:r>
-              <w:rPr>
-                <w:rFonts w:ascii="Consolas" w:cs="Consolas" w:eastAsia="Consolas" w:hAnsi="Consolas"/>
-                <w:b w:val="false"/>
-                <w:bCs w:val="false"/>
-                <w:color w:val="0D47A1"/>
-                <w:sz w:val="17"/>
-                <w:szCs w:val="17"/>
-              </w:rPr>
-              <w:t xml:space="preserve">.plastic/</w:t>
-            </w:r>
-            <w:r>
-              <w:rPr>
-                <w:rFonts w:ascii="Arial" w:cs="Arial" w:eastAsia="Arial" w:hAnsi="Arial"/>
-                <w:b w:val="false"/>
-                <w:bCs w:val="false"/>
-                <w:sz w:val="18"/>
-                <w:szCs w:val="18"/>
-              </w:rPr>
-              <w:t xml:space="preserve">, </w:t>
-            </w:r>
-            <w:r>
-              <w:rPr>
-                <w:rFonts w:ascii="Consolas" w:cs="Consolas" w:eastAsia="Consolas" w:hAnsi="Consolas"/>
-                <w:b w:val="false"/>
-                <w:bCs w:val="false"/>
-                <w:color w:val="0D47A1"/>
-                <w:sz w:val="17"/>
-                <w:szCs w:val="17"/>
-              </w:rPr>
-              <w:t xml:space="preserve">ignore.conf</w:t>
-            </w:r>
-            <w:r>
-              <w:rPr>
-                <w:rFonts w:ascii="Arial" w:cs="Arial" w:eastAsia="Arial" w:hAnsi="Arial"/>
-                <w:b w:val="false"/>
-                <w:bCs w:val="false"/>
-                <w:sz w:val="18"/>
-                <w:szCs w:val="18"/>
-              </w:rPr>
-              <w:t xml:space="preserve"> and </w:t>
-            </w:r>
-            <w:r>
-              <w:rPr>
-                <w:rFonts w:ascii="Consolas" w:cs="Consolas" w:eastAsia="Consolas" w:hAnsi="Consolas"/>
-                <w:b w:val="false"/>
-                <w:bCs w:val="false"/>
-                <w:color w:val="0D47A1"/>
-                <w:sz w:val="17"/>
-                <w:szCs w:val="17"/>
-              </w:rPr>
-              <w:t xml:space="preserve">TESTING CAPSTONE.slnx</w:t>
-            </w:r>
-            <w:r>
-              <w:rPr>
-                <w:rFonts w:ascii="Arial" w:cs="Arial" w:eastAsia="Arial" w:hAnsi="Arial"/>
-                <w:b w:val="false"/>
-                <w:bCs w:val="false"/>
-                <w:sz w:val="18"/>
-                <w:szCs w:val="18"/>
-              </w:rPr>
-              <w:t xml:space="preserve"> were committed before their ignore lines were added, so they must be removed from tracking once (see V.4).</w:t>
+              <w:t xml:space="preserve"> and none of the Plastic or IDE files (they were committed before their ignore lines existed and were removed from tracking in commit 12).</w:t>
             </w:r>
           </w:p>
         </w:tc>
@@ -22590,7 +22545,7 @@
                 <w:sz w:val="18"/>
                 <w:szCs w:val="18"/>
               </w:rPr>
-              <w:t xml:space="preserve">Partly set</w:t>
+              <w:t xml:space="preserve">Done</w:t>
             </w:r>
           </w:p>
         </w:tc>
@@ -22643,7 +22598,7 @@
                 <w:sz w:val="18"/>
                 <w:szCs w:val="18"/>
               </w:rPr>
-              <w:t xml:space="preserve"> (set). Version Control mode is still </w:t>
+              <w:t xml:space="preserve">. Version Control mode: </w:t>
             </w:r>
             <w:r>
               <w:rPr>
@@ -22653,7 +22608,7 @@
                 <w:sz w:val="18"/>
                 <w:szCs w:val="18"/>
               </w:rPr>
-              <w:t xml:space="preserve">Unity Version Control (Plastic)</w:t>
+              <w:t xml:space="preserve">Visible Meta Files</w:t>
             </w:r>
             <w:r>
               <w:rPr>
@@ -22663,27 +22618,7 @@
                 <w:sz w:val="18"/>
                 <w:szCs w:val="18"/>
               </w:rPr>
-              <w:t xml:space="preserve">; change it to </w:t>
-            </w:r>
-            <w:r>
-              <w:rPr>
-                <w:rFonts w:ascii="Arial" w:cs="Arial" w:eastAsia="Arial" w:hAnsi="Arial"/>
-                <w:b/>
-                <w:bCs/>
-                <w:sz w:val="18"/>
-                <w:szCs w:val="18"/>
-              </w:rPr>
-              <w:t xml:space="preserve">Visible Meta Files</w:t>
-            </w:r>
-            <w:r>
-              <w:rPr>
-                <w:rFonts w:ascii="Arial" w:cs="Arial" w:eastAsia="Arial" w:hAnsi="Arial"/>
-                <w:b w:val="false"/>
-                <w:bCs w:val="false"/>
-                <w:sz w:val="18"/>
-                <w:szCs w:val="18"/>
-              </w:rPr>
-              <w:t xml:space="preserve"> (Edit ▸ Project Settings ▸ Version Control) because the team uses Git and GitHub.</w:t>
+              <w:t xml:space="preserve"> (changed from Unity Version Control in commit 14, because the team uses Git and GitHub).</w:t>
             </w:r>
           </w:p>
         </w:tc>
@@ -22767,7 +22702,18 @@
                 <w:sz w:val="18"/>
                 <w:szCs w:val="18"/>
               </w:rPr>
-              <w:t xml:space="preserve"> only (current)</w:t>
+              <w:t xml:space="preserve"> and </w:t>
+            </w:r>
+            <w:r>
+              <w:rPr>
+                <w:rFonts w:ascii="Consolas" w:cs="Consolas" w:eastAsia="Consolas" w:hAnsi="Consolas"/>
+                <w:b w:val="false"/>
+                <w:bCs w:val="false"/>
+                <w:color w:val="0D47A1"/>
+                <w:sz w:val="17"/>
+                <w:szCs w:val="17"/>
+              </w:rPr>
+              <w:t xml:space="preserve">develop</w:t>
             </w:r>
           </w:p>
         </w:tc>
@@ -22811,7 +22757,7 @@
                 <w:sz w:val="18"/>
                 <w:szCs w:val="18"/>
               </w:rPr>
-              <w:t xml:space="preserve"> everything is on </w:t>
+              <w:t xml:space="preserve"> </w:t>
             </w:r>
             <w:r>
               <w:rPr>
@@ -22832,7 +22778,28 @@
                 <w:sz w:val="18"/>
                 <w:szCs w:val="18"/>
               </w:rPr>
-              <w:t xml:space="preserve">, which builds and plays.</w:t>
+              <w:t xml:space="preserve"> (stable, builds and plays) and </w:t>
+            </w:r>
+            <w:r>
+              <w:rPr>
+                <w:rFonts w:ascii="Consolas" w:cs="Consolas" w:eastAsia="Consolas" w:hAnsi="Consolas"/>
+                <w:b w:val="false"/>
+                <w:bCs w:val="false"/>
+                <w:color w:val="0D47A1"/>
+                <w:sz w:val="17"/>
+                <w:szCs w:val="17"/>
+              </w:rPr>
+              <w:t xml:space="preserve">develop</w:t>
+            </w:r>
+            <w:r>
+              <w:rPr>
+                <w:rFonts w:ascii="Arial" w:cs="Arial" w:eastAsia="Arial" w:hAnsi="Arial"/>
+                <w:b w:val="false"/>
+                <w:bCs w:val="false"/>
+                <w:sz w:val="18"/>
+                <w:szCs w:val="18"/>
+              </w:rPr>
+              <w:t xml:space="preserve"> (integration), both at the same commit.</w:t>
             </w:r>
           </w:p>
           <w:p>
@@ -22868,7 +22835,7 @@
                 <w:sz w:val="17"/>
                 <w:szCs w:val="17"/>
               </w:rPr>
-              <w:t xml:space="preserve">main</w:t>
+              <w:t xml:space="preserve">feature/&lt;system&gt;</w:t>
             </w:r>
             <w:r>
               <w:rPr>
@@ -22878,7 +22845,7 @@
                 <w:sz w:val="18"/>
                 <w:szCs w:val="18"/>
               </w:rPr>
-              <w:t xml:space="preserve"> = stable, demo-ready; </w:t>
+              <w:t xml:space="preserve"> branches off </w:t>
             </w:r>
             <w:r>
               <w:rPr>
@@ -22890,27 +22857,6 @@
                 <w:szCs w:val="17"/>
               </w:rPr>
               <w:t xml:space="preserve">develop</w:t>
-            </w:r>
-            <w:r>
-              <w:rPr>
-                <w:rFonts w:ascii="Arial" w:cs="Arial" w:eastAsia="Arial" w:hAnsi="Arial"/>
-                <w:b w:val="false"/>
-                <w:bCs w:val="false"/>
-                <w:sz w:val="18"/>
-                <w:szCs w:val="18"/>
-              </w:rPr>
-              <w:t xml:space="preserve"> = integration; </w:t>
-            </w:r>
-            <w:r>
-              <w:rPr>
-                <w:rFonts w:ascii="Consolas" w:cs="Consolas" w:eastAsia="Consolas" w:hAnsi="Consolas"/>
-                <w:b w:val="false"/>
-                <w:bCs w:val="false"/>
-                <w:color w:val="0D47A1"/>
-                <w:sz w:val="17"/>
-                <w:szCs w:val="17"/>
-              </w:rPr>
-              <w:t xml:space="preserve">feature/&lt;system&gt;</w:t>
             </w:r>
             <w:r>
               <w:rPr>
@@ -23596,7 +23542,7 @@
           <w:sz w:val="15"/>
           <w:szCs w:val="15"/>
         </w:rPr>
-        <w:t xml:space="preserve">│   ├── Scenes/SampleScene.unity            Unity template scene, still enabled in Build Settings (to remove)</w:t>
+        <w:t xml:space="preserve">│   ├── Scenes/SampleScene.unity            Unity template scene (disabled in Build Settings)</w:t>
       </w:r>
     </w:p>
     <w:p>
@@ -23698,7 +23644,24 @@
           <w:sz w:val="15"/>
           <w:szCs w:val="15"/>
         </w:rPr>
-        <w:t xml:space="preserve">├── ProjectSettings/                        Unity project settings (Force Text serialization)</w:t>
+        <w:t xml:space="preserve">├── ProjectSettings/                        Unity project settings (Force Text, Visible Meta Files)</w:t>
+      </w:r>
+    </w:p>
+    <w:p>
+      <w:pPr>
+        <w:keepNext/>
+        <w:shd w:fill="F4F6F8" w:color="auto" w:val="clear"/>
+        <w:spacing w:after="0" w:line="200"/>
+        <w:ind w:left="200" w:right="200"/>
+      </w:pPr>
+      <w:r>
+        <w:rPr>
+          <w:rFonts w:ascii="Consolas" w:cs="Consolas" w:eastAsia="Consolas" w:hAnsi="Consolas"/>
+          <w:color w:val="263238"/>
+          <w:sz w:val="15"/>
+          <w:szCs w:val="15"/>
+        </w:rPr>
+        <w:t xml:space="preserve">├── Docs/                                   Parts I–VI documentation (.docx) and Figures/</w:t>
       </w:r>
     </w:p>
     <w:p>
@@ -23800,24 +23763,7 @@
           <w:sz w:val="15"/>
           <w:szCs w:val="15"/>
         </w:rPr>
-        <w:t xml:space="preserve">  Library/  Temp/  Logs/  UserSettings/  *.csproj</w:t>
-      </w:r>
-    </w:p>
-    <w:p>
-      <w:pPr>
-        <w:keepNext/>
-        <w:shd w:fill="F4F6F8" w:color="auto" w:val="clear"/>
-        <w:spacing w:after="0" w:line="200"/>
-        <w:ind w:left="200" w:right="200"/>
-      </w:pPr>
-      <w:r>
-        <w:rPr>
-          <w:rFonts w:ascii="Consolas" w:cs="Consolas" w:eastAsia="Consolas" w:hAnsi="Consolas"/>
-          <w:color w:val="263238"/>
-          <w:sz w:val="15"/>
-          <w:szCs w:val="15"/>
-        </w:rPr>
-        <w:t xml:space="preserve">  thermo_tactics.db  → created on the device in Application.persistentDataPath</w:t>
+        <w:t xml:space="preserve">  Library/  Temp/  Logs/  UserSettings/  *.csproj  *.slnx  .plastic/  ignore.conf</w:t>
       </w:r>
     </w:p>
     <w:p>
@@ -23834,7 +23780,7 @@
           <w:sz w:val="15"/>
           <w:szCs w:val="15"/>
         </w:rPr>
-        <w:t xml:space="preserve">Tracked by mistake, to be removed (V.4): .plastic/  ignore.conf  TESTING CAPSTONE.slnx</w:t>
+        <w:t xml:space="preserve">  thermo_tactics.db  → created on the device in Application.persistentDataPath</w:t>
       </w:r>
     </w:p>
     <w:p>
@@ -26878,6 +26824,144 @@
         </w:trPr>
         <w:tc>
           <w:tcPr>
+            <w:tcW w:type="dxa" w:w="3400"/>
+            <w:tcBorders>
+              <w:top w:val="single" w:color="B0BEC5" w:sz="4"/>
+              <w:left w:val="single" w:color="B0BEC5" w:sz="4"/>
+              <w:bottom w:val="single" w:color="B0BEC5" w:sz="4"/>
+              <w:right w:val="single" w:color="B0BEC5" w:sz="4"/>
+            </w:tcBorders>
+            <w:tcMar>
+              <w:top w:type="dxa" w:w="45"/>
+              <w:left w:type="dxa" w:w="90"/>
+              <w:bottom w:type="dxa" w:w="45"/>
+              <w:right w:type="dxa" w:w="90"/>
+            </w:tcMar>
+            <w:vAlign w:val="top"/>
+          </w:tcPr>
+          <w:p>
+            <w:pPr>
+              <w:spacing w:after="20" w:line="240"/>
+            </w:pPr>
+            <w:r>
+              <w:rPr>
+                <w:rFonts w:ascii="Arial" w:cs="Arial" w:eastAsia="Arial" w:hAnsi="Arial"/>
+                <w:sz w:val="17"/>
+                <w:szCs w:val="17"/>
+              </w:rPr>
+              <w:t xml:space="preserve">Architecture documentation</w:t>
+            </w:r>
+          </w:p>
+        </w:tc>
+        <w:tc>
+          <w:tcPr>
+            <w:tcW w:type="dxa" w:w="3700"/>
+            <w:tcBorders>
+              <w:top w:val="single" w:color="B0BEC5" w:sz="4"/>
+              <w:left w:val="single" w:color="B0BEC5" w:sz="4"/>
+              <w:bottom w:val="single" w:color="B0BEC5" w:sz="4"/>
+              <w:right w:val="single" w:color="B0BEC5" w:sz="4"/>
+            </w:tcBorders>
+            <w:tcMar>
+              <w:top w:type="dxa" w:w="45"/>
+              <w:left w:type="dxa" w:w="90"/>
+              <w:bottom w:type="dxa" w:w="45"/>
+              <w:right w:type="dxa" w:w="90"/>
+            </w:tcMar>
+            <w:vAlign w:val="top"/>
+          </w:tcPr>
+          <w:p>
+            <w:pPr>
+              <w:spacing w:after="20" w:line="240"/>
+            </w:pPr>
+            <w:r>
+              <w:rPr>
+                <w:rFonts w:ascii="Arial" w:cs="Arial" w:eastAsia="Arial" w:hAnsi="Arial"/>
+                <w:sz w:val="17"/>
+                <w:szCs w:val="17"/>
+              </w:rPr>
+              <w:t xml:space="preserve">—</w:t>
+            </w:r>
+          </w:p>
+        </w:tc>
+        <w:tc>
+          <w:tcPr>
+            <w:tcW w:type="dxa" w:w="3500"/>
+            <w:tcBorders>
+              <w:top w:val="single" w:color="B0BEC5" w:sz="4"/>
+              <w:left w:val="single" w:color="B0BEC5" w:sz="4"/>
+              <w:bottom w:val="single" w:color="B0BEC5" w:sz="4"/>
+              <w:right w:val="single" w:color="B0BEC5" w:sz="4"/>
+            </w:tcBorders>
+            <w:tcMar>
+              <w:top w:type="dxa" w:w="45"/>
+              <w:left w:type="dxa" w:w="90"/>
+              <w:bottom w:type="dxa" w:w="45"/>
+              <w:right w:type="dxa" w:w="90"/>
+            </w:tcMar>
+            <w:vAlign w:val="top"/>
+          </w:tcPr>
+          <w:p>
+            <w:pPr>
+              <w:spacing w:after="20" w:line="240"/>
+            </w:pPr>
+            <w:r>
+              <w:rPr>
+                <w:rFonts w:ascii="Consolas" w:cs="Consolas" w:eastAsia="Consolas" w:hAnsi="Consolas"/>
+                <w:color w:val="0D47A1"/>
+                <w:sz w:val="16"/>
+                <w:szCs w:val="16"/>
+              </w:rPr>
+              <w:t xml:space="preserve">Docs/</w:t>
+            </w:r>
+            <w:r>
+              <w:rPr>
+                <w:rFonts w:ascii="Arial" w:cs="Arial" w:eastAsia="Arial" w:hAnsi="Arial"/>
+                <w:sz w:val="17"/>
+                <w:szCs w:val="17"/>
+              </w:rPr>
+              <w:t xml:space="preserve"> (repository root)</w:t>
+            </w:r>
+          </w:p>
+        </w:tc>
+        <w:tc>
+          <w:tcPr>
+            <w:tcW w:type="dxa" w:w="3800"/>
+            <w:tcBorders>
+              <w:top w:val="single" w:color="B0BEC5" w:sz="4"/>
+              <w:left w:val="single" w:color="B0BEC5" w:sz="4"/>
+              <w:bottom w:val="single" w:color="B0BEC5" w:sz="4"/>
+              <w:right w:val="single" w:color="B0BEC5" w:sz="4"/>
+            </w:tcBorders>
+            <w:tcMar>
+              <w:top w:type="dxa" w:w="45"/>
+              <w:left w:type="dxa" w:w="90"/>
+              <w:bottom w:type="dxa" w:w="45"/>
+              <w:right w:type="dxa" w:w="90"/>
+            </w:tcMar>
+            <w:vAlign w:val="top"/>
+          </w:tcPr>
+          <w:p>
+            <w:pPr>
+              <w:spacing w:after="20" w:line="240"/>
+            </w:pPr>
+            <w:r>
+              <w:rPr>
+                <w:rFonts w:ascii="Arial" w:cs="Arial" w:eastAsia="Arial" w:hAnsi="Arial"/>
+                <w:sz w:val="17"/>
+                <w:szCs w:val="17"/>
+              </w:rPr>
+              <w:t xml:space="preserve">Parts I–VI and Figures 1–4</w:t>
+            </w:r>
+          </w:p>
+        </w:tc>
+      </w:tr>
+      <w:tr>
+        <w:trPr>
+          <w:cantSplit/>
+        </w:trPr>
+        <w:tc>
+          <w:tcPr>
             <w:tcW w:type="dxa" w:w="14400"/>
             <w:gridSpan w:val="4"/>
             <w:tcBorders>
@@ -27281,7 +27365,7 @@
         <w:spacing w:after="90" w:before="200"/>
       </w:pPr>
       <w:r>
-        <w:t xml:space="preserve">V.4 Housekeeping still to do</w:t>
+        <w:t xml:space="preserve">V.4 Housekeeping completed on 9 October 2026</w:t>
       </w:r>
     </w:p>
     <w:p>
@@ -27299,58 +27383,24 @@
           <w:sz w:val="20"/>
           <w:szCs w:val="20"/>
         </w:rPr>
-        <w:t xml:space="preserve">Remove the files committed before their ignore rules existed (the files stay on disk):</w:t>
+        <w:t xml:space="preserve">Plastic and IDE files removed from tracking (</w:t>
       </w:r>
-    </w:p>
-    <w:p>
-      <w:pPr>
-        <w:keepNext/>
-        <w:shd w:fill="F4F6F8" w:color="auto" w:val="clear"/>
-        <w:spacing w:after="0" w:line="228"/>
-        <w:ind w:left="200" w:right="200"/>
-      </w:pPr>
       <w:r>
         <w:rPr>
           <w:rFonts w:ascii="Consolas" w:cs="Consolas" w:eastAsia="Consolas" w:hAnsi="Consolas"/>
-          <w:color w:val="263238"/>
-          <w:sz w:val="17"/>
-          <w:szCs w:val="17"/>
+          <w:color w:val="0D47A1"/>
+          <w:sz w:val="19"/>
+          <w:szCs w:val="19"/>
         </w:rPr>
         <w:t xml:space="preserve">git rm -r --cached .plastic ignore.conf "TESTING CAPSTONE.slnx"</w:t>
       </w:r>
-    </w:p>
-    <w:p>
-      <w:pPr>
-        <w:keepNext/>
-        <w:shd w:fill="F4F6F8" w:color="auto" w:val="clear"/>
-        <w:spacing w:after="0" w:line="228"/>
-        <w:ind w:left="200" w:right="200"/>
-      </w:pPr>
       <w:r>
         <w:rPr>
-          <w:rFonts w:ascii="Consolas" w:cs="Consolas" w:eastAsia="Consolas" w:hAnsi="Consolas"/>
-          <w:color w:val="263238"/>
-          <w:sz w:val="17"/>
-          <w:szCs w:val="17"/>
+          <w:rFonts w:ascii="Arial" w:cs="Arial" w:eastAsia="Arial" w:hAnsi="Arial"/>
+          <w:sz w:val="20"/>
+          <w:szCs w:val="20"/>
         </w:rPr>
-        <w:t xml:space="preserve">git commit -m "chore: stop tracking Plastic and IDE files"</w:t>
-      </w:r>
-    </w:p>
-    <w:p>
-      <w:pPr>
-        <w:keepNext w:val="false"/>
-        <w:shd w:fill="F4F6F8" w:color="auto" w:val="clear"/>
-        <w:spacing w:after="0" w:line="228"/>
-        <w:ind w:left="200" w:right="200"/>
-      </w:pPr>
-      <w:r>
-        <w:rPr>
-          <w:rFonts w:ascii="Consolas" w:cs="Consolas" w:eastAsia="Consolas" w:hAnsi="Consolas"/>
-          <w:color w:val="263238"/>
-          <w:sz w:val="17"/>
-          <w:szCs w:val="17"/>
-        </w:rPr>
-        <w:t xml:space="preserve">git push</w:t>
+        <w:t xml:space="preserve">), commit 12.</w:t>
       </w:r>
     </w:p>
     <w:p>
@@ -27368,7 +27418,25 @@
           <w:sz w:val="20"/>
           <w:szCs w:val="20"/>
         </w:rPr>
-        <w:t xml:space="preserve">In Unity, set Edit ▸ Project Settings ▸ Version Control ▸ Mode to </w:t>
+        <w:t xml:space="preserve">README corrected and team members added, commit 13.</w:t>
+      </w:r>
+    </w:p>
+    <w:p>
+      <w:pPr>
+        <w:pStyle w:val="ListParagraph"/>
+        <w:numPr>
+          <w:ilvl w:val="0"/>
+          <w:numId w:val="2"/>
+        </w:numPr>
+        <w:spacing w:after="50" w:line="264"/>
+      </w:pPr>
+      <w:r>
+        <w:rPr>
+          <w:rFonts w:ascii="Arial" w:cs="Arial" w:eastAsia="Arial" w:hAnsi="Arial"/>
+          <w:sz w:val="20"/>
+          <w:szCs w:val="20"/>
+        </w:rPr>
+        <w:t xml:space="preserve">Unity settings: Version Control mode </w:t>
       </w:r>
       <w:r>
         <w:rPr>
@@ -27386,7 +27454,7 @@
           <w:sz w:val="20"/>
           <w:szCs w:val="20"/>
         </w:rPr>
-        <w:t xml:space="preserve">, Player ▸ Product Name to </w:t>
+        <w:t xml:space="preserve">, product name </w:t>
       </w:r>
       <w:r>
         <w:rPr>
@@ -27404,7 +27472,7 @@
           <w:sz w:val="20"/>
           <w:szCs w:val="20"/>
         </w:rPr>
-        <w:t xml:space="preserve">, and untick </w:t>
+        <w:t xml:space="preserve">, </w:t>
       </w:r>
       <w:r>
         <w:rPr>
@@ -27413,7 +27481,7 @@
           <w:sz w:val="19"/>
           <w:szCs w:val="19"/>
         </w:rPr>
-        <w:t xml:space="preserve">Assets/Scenes/SampleScene.unity</w:t>
+        <w:t xml:space="preserve">SampleScene</w:t>
       </w:r>
       <w:r>
         <w:rPr>
@@ -27421,24 +27489,7 @@
           <w:sz w:val="20"/>
           <w:szCs w:val="20"/>
         </w:rPr>
-        <w:t xml:space="preserve"> in File ▸ Build Profiles so only Baguio_Level1 is built; commit the changed </w:t>
-      </w:r>
-      <w:r>
-        <w:rPr>
-          <w:rFonts w:ascii="Consolas" w:cs="Consolas" w:eastAsia="Consolas" w:hAnsi="Consolas"/>
-          <w:color w:val="0D47A1"/>
-          <w:sz w:val="19"/>
-          <w:szCs w:val="19"/>
-        </w:rPr>
-        <w:t xml:space="preserve">ProjectSettings/</w:t>
-      </w:r>
-      <w:r>
-        <w:rPr>
-          <w:rFonts w:ascii="Arial" w:cs="Arial" w:eastAsia="Arial" w:hAnsi="Arial"/>
-          <w:sz w:val="20"/>
-          <w:szCs w:val="20"/>
-        </w:rPr>
-        <w:t xml:space="preserve">.</w:t>
+        <w:t xml:space="preserve"> disabled in Build Profiles so only Baguio_Level1 is built, commit 14.</w:t>
       </w:r>
     </w:p>
     <w:p>
@@ -27456,7 +27507,7 @@
           <w:sz w:val="20"/>
           <w:szCs w:val="20"/>
         </w:rPr>
-        <w:t xml:space="preserve">Fill in the Team table in </w:t>
+        <w:t xml:space="preserve">Parts I–VI documentation added under </w:t>
       </w:r>
       <w:r>
         <w:rPr>
@@ -27465,7 +27516,7 @@
           <w:sz w:val="19"/>
           <w:szCs w:val="19"/>
         </w:rPr>
-        <w:t xml:space="preserve">README.md</w:t>
+        <w:t xml:space="preserve">Docs/</w:t>
       </w:r>
       <w:r>
         <w:rPr>
@@ -27473,7 +27524,7 @@
           <w:sz w:val="20"/>
           <w:szCs w:val="20"/>
         </w:rPr>
-        <w:t xml:space="preserve">.</w:t>
+        <w:t xml:space="preserve">, commit 15.</w:t>
       </w:r>
     </w:p>
     <w:p>
@@ -27485,14 +27536,6 @@
         </w:numPr>
         <w:spacing w:after="50" w:line="264"/>
       </w:pPr>
-      <w:r>
-        <w:rPr>
-          <w:rFonts w:ascii="Arial" w:cs="Arial" w:eastAsia="Arial" w:hAnsi="Arial"/>
-          <w:sz w:val="20"/>
-          <w:szCs w:val="20"/>
-        </w:rPr>
-        <w:t xml:space="preserve">Create the </w:t>
-      </w:r>
       <w:r>
         <w:rPr>
           <w:rFonts w:ascii="Consolas" w:cs="Consolas" w:eastAsia="Consolas" w:hAnsi="Consolas"/>
@@ -27508,16 +27551,30 @@
           <w:sz w:val="20"/>
           <w:szCs w:val="20"/>
         </w:rPr>
-        <w:t xml:space="preserve"> branch: </w:t>
+        <w:t xml:space="preserve"> branch created and pushed.</w:t>
+      </w:r>
+    </w:p>
+    <w:p>
+      <w:pPr>
+        <w:spacing w:after="110" w:before="80" w:line="276"/>
+      </w:pPr>
+      <w:r>
+        <w:rPr>
+          <w:rFonts w:ascii="Arial" w:cs="Arial" w:eastAsia="Arial" w:hAnsi="Arial"/>
+          <w:sz w:val="20"/>
+          <w:szCs w:val="20"/>
+        </w:rPr>
+        <w:t xml:space="preserve">Still open: each member's role in the README team table, and the GitHub </w:t>
       </w:r>
       <w:r>
         <w:rPr>
-          <w:rFonts w:ascii="Consolas" w:cs="Consolas" w:eastAsia="Consolas" w:hAnsi="Consolas"/>
-          <w:color w:val="0D47A1"/>
-          <w:sz w:val="19"/>
-          <w:szCs w:val="19"/>
+          <w:rFonts w:ascii="Arial" w:cs="Arial" w:eastAsia="Arial" w:hAnsi="Arial"/>
+          <w:b/>
+          <w:bCs/>
+          <w:sz w:val="20"/>
+          <w:szCs w:val="20"/>
         </w:rPr>
-        <w:t xml:space="preserve">git checkout -b develop</w:t>
+        <w:t xml:space="preserve">About</w:t>
       </w:r>
       <w:r>
         <w:rPr>
@@ -27525,24 +27582,7 @@
           <w:sz w:val="20"/>
           <w:szCs w:val="20"/>
         </w:rPr>
-        <w:t xml:space="preserve"> then </w:t>
-      </w:r>
-      <w:r>
-        <w:rPr>
-          <w:rFonts w:ascii="Consolas" w:cs="Consolas" w:eastAsia="Consolas" w:hAnsi="Consolas"/>
-          <w:color w:val="0D47A1"/>
-          <w:sz w:val="19"/>
-          <w:szCs w:val="19"/>
-        </w:rPr>
-        <w:t xml:space="preserve">git push -u origin develop</w:t>
-      </w:r>
-      <w:r>
-        <w:rPr>
-          <w:rFonts w:ascii="Arial" w:cs="Arial" w:eastAsia="Arial" w:hAnsi="Arial"/>
-          <w:sz w:val="20"/>
-          <w:szCs w:val="20"/>
-        </w:rPr>
-        <w:t xml:space="preserve">.</w:t>
+        <w:t xml:space="preserve"> description and topics.</w:t>
       </w:r>
     </w:p>
     <w:p>
@@ -27601,7 +27641,24 @@
           <w:sz w:val="20"/>
           <w:szCs w:val="20"/>
         </w:rPr>
-        <w:t xml:space="preserve">, 11 commits) and the Unity project. </w:t>
+        <w:t xml:space="preserve"> and </w:t>
+      </w:r>
+      <w:r>
+        <w:rPr>
+          <w:rFonts w:ascii="Consolas" w:cs="Consolas" w:eastAsia="Consolas" w:hAnsi="Consolas"/>
+          <w:color w:val="0D47A1"/>
+          <w:sz w:val="19"/>
+          <w:szCs w:val="19"/>
+        </w:rPr>
+        <w:t xml:space="preserve">develop</w:t>
+      </w:r>
+      <w:r>
+        <w:rPr>
+          <w:rFonts w:ascii="Arial" w:cs="Arial" w:eastAsia="Arial" w:hAnsi="Arial"/>
+          <w:sz w:val="20"/>
+          <w:szCs w:val="20"/>
+        </w:rPr>
+        <w:t xml:space="preserve">, 15 commits) and the Unity project. </w:t>
       </w:r>
       <w:r>
         <w:rPr>
@@ -27929,7 +27986,7 @@
                 <w:sz w:val="16"/>
                 <w:szCs w:val="16"/>
               </w:rPr>
-              <w:t xml:space="preserve">; </w:t>
+              <w:t xml:space="preserve">; product name Thermo-Tactics; only </w:t>
             </w:r>
             <w:r>
               <w:rPr>
@@ -27946,7 +28003,7 @@
                 <w:sz w:val="16"/>
                 <w:szCs w:val="16"/>
               </w:rPr>
-              <w:t xml:space="preserve"> is the first scene in Build Settings; 0 console errors</w:t>
+              <w:t xml:space="preserve"> is enabled in Build Settings; Version Control mode Visible Meta Files; 0 console errors</w:t>
             </w:r>
           </w:p>
         </w:tc>
@@ -27977,7 +28034,7 @@
                 <w:sz w:val="16"/>
                 <w:szCs w:val="16"/>
               </w:rPr>
-              <w:t xml:space="preserve">Rename the product from "TESTING CAPSTONE" to Thermo-Tactics; set Version Control mode to Visible Meta Files; remove the template SampleScene from Build Settings; build and test an APK on a phone</w:t>
+              <w:t xml:space="preserve">Build and test an APK on an Android phone</w:t>
             </w:r>
           </w:p>
         </w:tc>
@@ -28118,7 +28175,7 @@
                 <w:sz w:val="16"/>
                 <w:szCs w:val="16"/>
               </w:rPr>
-              <w:t xml:space="preserve">Public; 11 commits on </w:t>
+              <w:t xml:space="preserve">Public; 15 commits; </w:t>
             </w:r>
             <w:r>
               <w:rPr>
@@ -28135,16 +28192,16 @@
                 <w:sz w:val="16"/>
                 <w:szCs w:val="16"/>
               </w:rPr>
-              <w:t xml:space="preserve">; README, </w:t>
-            </w:r>
-            <w:r>
-              <w:rPr>
-                <w:rFonts w:ascii="Consolas" w:cs="Consolas" w:eastAsia="Consolas" w:hAnsi="Consolas"/>
-                <w:color w:val="0D47A1"/>
-                <w:sz w:val="15"/>
-                <w:szCs w:val="15"/>
-              </w:rPr>
-              <w:t xml:space="preserve">.gitignore</w:t>
+              <w:t xml:space="preserve"> and </w:t>
+            </w:r>
+            <w:r>
+              <w:rPr>
+                <w:rFonts w:ascii="Consolas" w:cs="Consolas" w:eastAsia="Consolas" w:hAnsi="Consolas"/>
+                <w:color w:val="0D47A1"/>
+                <w:sz w:val="15"/>
+                <w:szCs w:val="15"/>
+              </w:rPr>
+              <w:t xml:space="preserve">develop</w:t>
             </w:r>
             <w:r>
               <w:rPr>
@@ -28152,16 +28209,16 @@
                 <w:sz w:val="16"/>
                 <w:szCs w:val="16"/>
               </w:rPr>
-              <w:t xml:space="preserve"> (0 </w:t>
-            </w:r>
-            <w:r>
-              <w:rPr>
-                <w:rFonts w:ascii="Consolas" w:cs="Consolas" w:eastAsia="Consolas" w:hAnsi="Consolas"/>
-                <w:color w:val="0D47A1"/>
-                <w:sz w:val="15"/>
-                <w:szCs w:val="15"/>
-              </w:rPr>
-              <w:t xml:space="preserve">Library/</w:t>
+              <w:t xml:space="preserve">; README with team; </w:t>
+            </w:r>
+            <w:r>
+              <w:rPr>
+                <w:rFonts w:ascii="Consolas" w:cs="Consolas" w:eastAsia="Consolas" w:hAnsi="Consolas"/>
+                <w:color w:val="0D47A1"/>
+                <w:sz w:val="15"/>
+                <w:szCs w:val="15"/>
+              </w:rPr>
+              <w:t xml:space="preserve">.gitignore</w:t>
             </w:r>
             <w:r>
               <w:rPr>
@@ -28169,16 +28226,16 @@
                 <w:sz w:val="16"/>
                 <w:szCs w:val="16"/>
               </w:rPr>
-              <w:t xml:space="preserve"> files tracked), </w:t>
-            </w:r>
-            <w:r>
-              <w:rPr>
-                <w:rFonts w:ascii="Consolas" w:cs="Consolas" w:eastAsia="Consolas" w:hAnsi="Consolas"/>
-                <w:color w:val="0D47A1"/>
-                <w:sz w:val="15"/>
-                <w:szCs w:val="15"/>
-              </w:rPr>
-              <w:t xml:space="preserve">.gitattributes</w:t>
+              <w:t xml:space="preserve"> (0 </w:t>
+            </w:r>
+            <w:r>
+              <w:rPr>
+                <w:rFonts w:ascii="Consolas" w:cs="Consolas" w:eastAsia="Consolas" w:hAnsi="Consolas"/>
+                <w:color w:val="0D47A1"/>
+                <w:sz w:val="15"/>
+                <w:szCs w:val="15"/>
+              </w:rPr>
+              <w:t xml:space="preserve">Library/</w:t>
             </w:r>
             <w:r>
               <w:rPr>
@@ -28186,65 +28243,74 @@
                 <w:sz w:val="16"/>
                 <w:szCs w:val="16"/>
               </w:rPr>
-              <w:t xml:space="preserve"> with LFS rules</w:t>
-            </w:r>
-          </w:p>
-        </w:tc>
-        <w:tc>
-          <w:tcPr>
-            <w:tcW w:type="dxa" w:w="3800"/>
-            <w:tcBorders>
-              <w:top w:val="single" w:color="B0BEC5" w:sz="4"/>
-              <w:left w:val="single" w:color="B0BEC5" w:sz="4"/>
-              <w:bottom w:val="single" w:color="B0BEC5" w:sz="4"/>
-              <w:right w:val="single" w:color="B0BEC5" w:sz="4"/>
-            </w:tcBorders>
-            <w:shd w:fill="F5F8FC" w:color="auto" w:val="clear"/>
-            <w:tcMar>
-              <w:top w:type="dxa" w:w="45"/>
-              <w:left w:type="dxa" w:w="90"/>
-              <w:bottom w:type="dxa" w:w="45"/>
-              <w:right w:type="dxa" w:w="90"/>
-            </w:tcMar>
-            <w:vAlign w:val="top"/>
-          </w:tcPr>
-          <w:p>
-            <w:pPr>
-              <w:spacing w:after="20" w:line="240"/>
-            </w:pPr>
+              <w:t xml:space="preserve"> or Plastic files tracked); </w:t>
+            </w:r>
+            <w:r>
+              <w:rPr>
+                <w:rFonts w:ascii="Consolas" w:cs="Consolas" w:eastAsia="Consolas" w:hAnsi="Consolas"/>
+                <w:color w:val="0D47A1"/>
+                <w:sz w:val="15"/>
+                <w:szCs w:val="15"/>
+              </w:rPr>
+              <w:t xml:space="preserve">.gitattributes</w:t>
+            </w:r>
             <w:r>
               <w:rPr>
                 <w:rFonts w:ascii="Arial" w:cs="Arial" w:eastAsia="Arial" w:hAnsi="Arial"/>
                 <w:sz w:val="16"/>
                 <w:szCs w:val="16"/>
               </w:rPr>
-              <w:t xml:space="preserve">Stop tracking </w:t>
-            </w:r>
-            <w:r>
-              <w:rPr>
-                <w:rFonts w:ascii="Consolas" w:cs="Consolas" w:eastAsia="Consolas" w:hAnsi="Consolas"/>
-                <w:color w:val="0D47A1"/>
-                <w:sz w:val="15"/>
-                <w:szCs w:val="15"/>
-              </w:rPr>
-              <w:t xml:space="preserve">.plastic/</w:t>
-            </w:r>
+              <w:t xml:space="preserve"> with LFS rules; </w:t>
+            </w:r>
+            <w:r>
+              <w:rPr>
+                <w:rFonts w:ascii="Consolas" w:cs="Consolas" w:eastAsia="Consolas" w:hAnsi="Consolas"/>
+                <w:color w:val="0D47A1"/>
+                <w:sz w:val="15"/>
+                <w:szCs w:val="15"/>
+              </w:rPr>
+              <w:t xml:space="preserve">Docs/</w:t>
+            </w:r>
+          </w:p>
+        </w:tc>
+        <w:tc>
+          <w:tcPr>
+            <w:tcW w:type="dxa" w:w="3800"/>
+            <w:tcBorders>
+              <w:top w:val="single" w:color="B0BEC5" w:sz="4"/>
+              <w:left w:val="single" w:color="B0BEC5" w:sz="4"/>
+              <w:bottom w:val="single" w:color="B0BEC5" w:sz="4"/>
+              <w:right w:val="single" w:color="B0BEC5" w:sz="4"/>
+            </w:tcBorders>
+            <w:shd w:fill="F5F8FC" w:color="auto" w:val="clear"/>
+            <w:tcMar>
+              <w:top w:type="dxa" w:w="45"/>
+              <w:left w:type="dxa" w:w="90"/>
+              <w:bottom w:type="dxa" w:w="45"/>
+              <w:right w:type="dxa" w:w="90"/>
+            </w:tcMar>
+            <w:vAlign w:val="top"/>
+          </w:tcPr>
+          <w:p>
+            <w:pPr>
+              <w:spacing w:after="20" w:line="240"/>
+            </w:pPr>
             <w:r>
               <w:rPr>
                 <w:rFonts w:ascii="Arial" w:cs="Arial" w:eastAsia="Arial" w:hAnsi="Arial"/>
                 <w:sz w:val="16"/>
                 <w:szCs w:val="16"/>
               </w:rPr>
-              <w:t xml:space="preserve">, </w:t>
-            </w:r>
-            <w:r>
-              <w:rPr>
-                <w:rFonts w:ascii="Consolas" w:cs="Consolas" w:eastAsia="Consolas" w:hAnsi="Consolas"/>
-                <w:color w:val="0D47A1"/>
-                <w:sz w:val="15"/>
-                <w:szCs w:val="15"/>
-              </w:rPr>
-              <w:t xml:space="preserve">ignore.conf</w:t>
+              <w:t xml:space="preserve">Add member roles to the README; set the GitHub About description; start using </w:t>
+            </w:r>
+            <w:r>
+              <w:rPr>
+                <w:rFonts w:ascii="Consolas" w:cs="Consolas" w:eastAsia="Consolas" w:hAnsi="Consolas"/>
+                <w:color w:val="0D47A1"/>
+                <w:sz w:val="15"/>
+                <w:szCs w:val="15"/>
+              </w:rPr>
+              <w:t xml:space="preserve">feature/*</w:t>
             </w:r>
             <w:r>
               <w:rPr>
@@ -28252,41 +28318,7 @@
                 <w:sz w:val="16"/>
                 <w:szCs w:val="16"/>
               </w:rPr>
-              <w:t xml:space="preserve">, </w:t>
-            </w:r>
-            <w:r>
-              <w:rPr>
-                <w:rFonts w:ascii="Consolas" w:cs="Consolas" w:eastAsia="Consolas" w:hAnsi="Consolas"/>
-                <w:color w:val="0D47A1"/>
-                <w:sz w:val="15"/>
-                <w:szCs w:val="15"/>
-              </w:rPr>
-              <w:t xml:space="preserve">*.slnx</w:t>
-            </w:r>
-            <w:r>
-              <w:rPr>
-                <w:rFonts w:ascii="Arial" w:cs="Arial" w:eastAsia="Arial" w:hAnsi="Arial"/>
-                <w:sz w:val="16"/>
-                <w:szCs w:val="16"/>
-              </w:rPr>
-              <w:t xml:space="preserve">; create </w:t>
-            </w:r>
-            <w:r>
-              <w:rPr>
-                <w:rFonts w:ascii="Consolas" w:cs="Consolas" w:eastAsia="Consolas" w:hAnsi="Consolas"/>
-                <w:color w:val="0D47A1"/>
-                <w:sz w:val="15"/>
-                <w:szCs w:val="15"/>
-              </w:rPr>
-              <w:t xml:space="preserve">develop</w:t>
-            </w:r>
-            <w:r>
-              <w:rPr>
-                <w:rFonts w:ascii="Arial" w:cs="Arial" w:eastAsia="Arial" w:hAnsi="Arial"/>
-                <w:sz w:val="16"/>
-                <w:szCs w:val="16"/>
-              </w:rPr>
-              <w:t xml:space="preserve">; fill in the README team table</w:t>
+              <w:t xml:space="preserve"> branches</w:t>
             </w:r>
           </w:p>
         </w:tc>
@@ -28416,47 +28448,55 @@
                 <w:sz w:val="16"/>
                 <w:szCs w:val="16"/>
               </w:rPr>
-              <w:t xml:space="preserve">This document set and Figures 1–4, revised 9 October 2026 to match the build</w:t>
-            </w:r>
-          </w:p>
-        </w:tc>
-        <w:tc>
-          <w:tcPr>
-            <w:tcW w:type="dxa" w:w="3800"/>
-            <w:tcBorders>
-              <w:top w:val="single" w:color="B0BEC5" w:sz="4"/>
-              <w:left w:val="single" w:color="B0BEC5" w:sz="4"/>
-              <w:bottom w:val="single" w:color="B0BEC5" w:sz="4"/>
-              <w:right w:val="single" w:color="B0BEC5" w:sz="4"/>
-            </w:tcBorders>
-            <w:tcMar>
-              <w:top w:type="dxa" w:w="45"/>
-              <w:left w:type="dxa" w:w="90"/>
-              <w:bottom w:type="dxa" w:w="45"/>
-              <w:right w:type="dxa" w:w="90"/>
-            </w:tcMar>
-            <w:vAlign w:val="top"/>
-          </w:tcPr>
-          <w:p>
-            <w:pPr>
-              <w:spacing w:after="20" w:line="240"/>
-            </w:pPr>
+              <w:t xml:space="preserve">This document set and Figures 1–4, revised 9 October 2026 to match the build; stored in </w:t>
+            </w:r>
+            <w:r>
+              <w:rPr>
+                <w:rFonts w:ascii="Consolas" w:cs="Consolas" w:eastAsia="Consolas" w:hAnsi="Consolas"/>
+                <w:color w:val="0D47A1"/>
+                <w:sz w:val="15"/>
+                <w:szCs w:val="15"/>
+              </w:rPr>
+              <w:t xml:space="preserve">Docs/</w:t>
+            </w:r>
             <w:r>
               <w:rPr>
                 <w:rFonts w:ascii="Arial" w:cs="Arial" w:eastAsia="Arial" w:hAnsi="Arial"/>
                 <w:sz w:val="16"/>
                 <w:szCs w:val="16"/>
               </w:rPr>
-              <w:t xml:space="preserve">Team review and adviser sign-off; add to the repository under </w:t>
-            </w:r>
-            <w:r>
-              <w:rPr>
-                <w:rFonts w:ascii="Consolas" w:cs="Consolas" w:eastAsia="Consolas" w:hAnsi="Consolas"/>
-                <w:color w:val="0D47A1"/>
-                <w:sz w:val="15"/>
-                <w:szCs w:val="15"/>
-              </w:rPr>
-              <w:t xml:space="preserve">Docs/</w:t>
+              <w:t xml:space="preserve"> in the repository</w:t>
+            </w:r>
+          </w:p>
+        </w:tc>
+        <w:tc>
+          <w:tcPr>
+            <w:tcW w:type="dxa" w:w="3800"/>
+            <w:tcBorders>
+              <w:top w:val="single" w:color="B0BEC5" w:sz="4"/>
+              <w:left w:val="single" w:color="B0BEC5" w:sz="4"/>
+              <w:bottom w:val="single" w:color="B0BEC5" w:sz="4"/>
+              <w:right w:val="single" w:color="B0BEC5" w:sz="4"/>
+            </w:tcBorders>
+            <w:tcMar>
+              <w:top w:type="dxa" w:w="45"/>
+              <w:left w:type="dxa" w:w="90"/>
+              <w:bottom w:type="dxa" w:w="45"/>
+              <w:right w:type="dxa" w:w="90"/>
+            </w:tcMar>
+            <w:vAlign w:val="top"/>
+          </w:tcPr>
+          <w:p>
+            <w:pPr>
+              <w:spacing w:after="20" w:line="240"/>
+            </w:pPr>
+            <w:r>
+              <w:rPr>
+                <w:rFonts w:ascii="Arial" w:cs="Arial" w:eastAsia="Arial" w:hAnsi="Arial"/>
+                <w:sz w:val="16"/>
+                <w:szCs w:val="16"/>
+              </w:rPr>
+              <w:t xml:space="preserve">Team review and adviser sign-off</w:t>
             </w:r>
           </w:p>
         </w:tc>
@@ -31173,7 +31213,7 @@
                 <w:sz w:val="18"/>
                 <w:szCs w:val="18"/>
               </w:rPr>
-              <w:t xml:space="preserve">Android build and repository workflow</w:t>
+              <w:t xml:space="preserve">Android build and team workflow</w:t>
             </w:r>
           </w:p>
         </w:tc>
@@ -31204,7 +31244,7 @@
                 <w:sz w:val="18"/>
                 <w:szCs w:val="18"/>
               </w:rPr>
-              <w:t xml:space="preserve">The playable Level 1 and the repository (both exist now)</w:t>
+              <w:t xml:space="preserve">The playable Level 1 and the cleaned-up repository (both exist now)</w:t>
             </w:r>
           </w:p>
         </w:tc>
@@ -31235,7 +31275,7 @@
                 <w:sz w:val="18"/>
                 <w:szCs w:val="18"/>
               </w:rPr>
-              <w:t xml:space="preserve">Product renamed; Version Control set to Visible Meta Files; SampleScene out of the build; Plastic and IDE files untracked; </w:t>
+              <w:t xml:space="preserve">The "Result saved" message fixed; an APK that runs on a test phone and saves results to SQLite; </w:t>
             </w:r>
             <w:r>
               <w:rPr>
@@ -31244,7 +31284,7 @@
                 <w:sz w:val="17"/>
                 <w:szCs w:val="17"/>
               </w:rPr>
-              <w:t xml:space="preserve">develop</w:t>
+              <w:t xml:space="preserve">feature/*</w:t>
             </w:r>
             <w:r>
               <w:rPr>
@@ -31252,7 +31292,24 @@
                 <w:sz w:val="18"/>
                 <w:szCs w:val="18"/>
               </w:rPr>
-              <w:t xml:space="preserve"> branch; the "Result saved" message fixed; an APK that runs on a test phone and saves results to SQLite</w:t>
+              <w:t xml:space="preserve"> branches and pull requests in use. (Repository clean-up, product rename, Visible Meta Files, SampleScene removal and the </w:t>
+            </w:r>
+            <w:r>
+              <w:rPr>
+                <w:rFonts w:ascii="Consolas" w:cs="Consolas" w:eastAsia="Consolas" w:hAnsi="Consolas"/>
+                <w:color w:val="0D47A1"/>
+                <w:sz w:val="17"/>
+                <w:szCs w:val="17"/>
+              </w:rPr>
+              <w:t xml:space="preserve">develop</w:t>
+            </w:r>
+            <w:r>
+              <w:rPr>
+                <w:rFonts w:ascii="Arial" w:cs="Arial" w:eastAsia="Arial" w:hAnsi="Arial"/>
+                <w:sz w:val="18"/>
+                <w:szCs w:val="18"/>
+              </w:rPr>
+              <w:t xml:space="preserve"> branch are already done.)</w:t>
             </w:r>
           </w:p>
         </w:tc>

</xml_diff>